<commit_message>
Cleaned up main repo + wrote some critical analysis in assignment report
</commit_message>
<xml_diff>
--- a/Assignment Report.docx
+++ b/Assignment Report.docx
@@ -181,6 +181,15 @@
     </w:p>
     <w:sdt>
       <w:sdtPr>
+        <w:rPr>
+          <w:rFonts w:asciiTheme="minorHAnsi" w:eastAsiaTheme="minorEastAsia" w:hAnsiTheme="minorHAnsi" w:cstheme="minorBidi"/>
+          <w:color w:val="auto"/>
+          <w:kern w:val="2"/>
+          <w:sz w:val="24"/>
+          <w:szCs w:val="24"/>
+          <w:lang w:val="en-GB" w:eastAsia="ja-JP"/>
+          <w14:ligatures w14:val="standardContextual"/>
+        </w:rPr>
         <w:id w:val="1591652681"/>
         <w:docPartObj>
           <w:docPartGallery w:val="Table of Contents"/>
@@ -189,16 +198,9 @@
       </w:sdtPr>
       <w:sdtEndPr>
         <w:rPr>
-          <w:rFonts w:asciiTheme="minorHAnsi" w:eastAsiaTheme="minorEastAsia" w:hAnsiTheme="minorHAnsi" w:cstheme="minorBidi"/>
           <w:b/>
           <w:bCs/>
           <w:noProof/>
-          <w:color w:val="auto"/>
-          <w:kern w:val="2"/>
-          <w:sz w:val="24"/>
-          <w:szCs w:val="24"/>
-          <w:lang w:val="en-GB" w:eastAsia="ja-JP"/>
-          <w14:ligatures w14:val="standardContextual"/>
         </w:rPr>
       </w:sdtEndPr>
       <w:sdtContent>
@@ -230,7 +232,7 @@
           <w:r>
             <w:fldChar w:fldCharType="separate"/>
           </w:r>
-          <w:hyperlink w:anchor="_Toc228358939" w:history="1">
+          <w:hyperlink w:anchor="_Toc228382386" w:history="1">
             <w:r>
               <w:rPr>
                 <w:rStyle w:val="Hyperlink"/>
@@ -258,7 +260,7 @@
                 <w:noProof/>
                 <w:webHidden/>
               </w:rPr>
-              <w:instrText xml:space="preserve"> PAGEREF _Toc228358939 \h </w:instrText>
+              <w:instrText xml:space="preserve"> PAGEREF _Toc228382386 \h </w:instrText>
             </w:r>
             <w:r>
               <w:rPr>
@@ -300,7 +302,7 @@
               <w:lang w:eastAsia="zh-CN"/>
             </w:rPr>
           </w:pPr>
-          <w:hyperlink w:anchor="_Toc228358940" w:history="1">
+          <w:hyperlink w:anchor="_Toc228382387" w:history="1">
             <w:r>
               <w:rPr>
                 <w:rStyle w:val="Hyperlink"/>
@@ -328,7 +330,7 @@
                 <w:noProof/>
                 <w:webHidden/>
               </w:rPr>
-              <w:instrText xml:space="preserve"> PAGEREF _Toc228358940 \h </w:instrText>
+              <w:instrText xml:space="preserve"> PAGEREF _Toc228382387 \h </w:instrText>
             </w:r>
             <w:r>
               <w:rPr>
@@ -348,7 +350,7 @@
                 <w:noProof/>
                 <w:webHidden/>
               </w:rPr>
-              <w:t>4</w:t>
+              <w:t>3</w:t>
             </w:r>
             <w:r>
               <w:rPr>
@@ -370,7 +372,7 @@
               <w:lang w:eastAsia="zh-CN"/>
             </w:rPr>
           </w:pPr>
-          <w:hyperlink w:anchor="_Toc228358941" w:history="1">
+          <w:hyperlink w:anchor="_Toc228382388" w:history="1">
             <w:r>
               <w:rPr>
                 <w:rStyle w:val="Hyperlink"/>
@@ -397,7 +399,7 @@
                 <w:noProof/>
                 <w:webHidden/>
               </w:rPr>
-              <w:instrText xml:space="preserve"> PAGEREF _Toc228358941 \h </w:instrText>
+              <w:instrText xml:space="preserve"> PAGEREF _Toc228382388 \h </w:instrText>
             </w:r>
             <w:r>
               <w:rPr>
@@ -417,7 +419,7 @@
                 <w:noProof/>
                 <w:webHidden/>
               </w:rPr>
-              <w:t>4</w:t>
+              <w:t>3</w:t>
             </w:r>
             <w:r>
               <w:rPr>
@@ -439,7 +441,7 @@
               <w:lang w:eastAsia="zh-CN"/>
             </w:rPr>
           </w:pPr>
-          <w:hyperlink w:anchor="_Toc228358942" w:history="1">
+          <w:hyperlink w:anchor="_Toc228382389" w:history="1">
             <w:r>
               <w:rPr>
                 <w:rStyle w:val="Hyperlink"/>
@@ -466,7 +468,7 @@
                 <w:noProof/>
                 <w:webHidden/>
               </w:rPr>
-              <w:instrText xml:space="preserve"> PAGEREF _Toc228358942 \h </w:instrText>
+              <w:instrText xml:space="preserve"> PAGEREF _Toc228382389 \h </w:instrText>
             </w:r>
             <w:r>
               <w:rPr>
@@ -486,7 +488,7 @@
                 <w:noProof/>
                 <w:webHidden/>
               </w:rPr>
-              <w:t>4</w:t>
+              <w:t>3</w:t>
             </w:r>
             <w:r>
               <w:rPr>
@@ -508,7 +510,7 @@
               <w:lang w:eastAsia="zh-CN"/>
             </w:rPr>
           </w:pPr>
-          <w:hyperlink w:anchor="_Toc228358943" w:history="1">
+          <w:hyperlink w:anchor="_Toc228382390" w:history="1">
             <w:r>
               <w:rPr>
                 <w:rStyle w:val="Hyperlink"/>
@@ -535,7 +537,7 @@
                 <w:noProof/>
                 <w:webHidden/>
               </w:rPr>
-              <w:instrText xml:space="preserve"> PAGEREF _Toc228358943 \h </w:instrText>
+              <w:instrText xml:space="preserve"> PAGEREF _Toc228382390 \h </w:instrText>
             </w:r>
             <w:r>
               <w:rPr>
@@ -555,7 +557,7 @@
                 <w:noProof/>
                 <w:webHidden/>
               </w:rPr>
-              <w:t>4</w:t>
+              <w:t>3</w:t>
             </w:r>
             <w:r>
               <w:rPr>
@@ -577,7 +579,7 @@
               <w:lang w:eastAsia="zh-CN"/>
             </w:rPr>
           </w:pPr>
-          <w:hyperlink w:anchor="_Toc228358944" w:history="1">
+          <w:hyperlink w:anchor="_Toc228382391" w:history="1">
             <w:r>
               <w:rPr>
                 <w:rStyle w:val="Hyperlink"/>
@@ -604,7 +606,7 @@
                 <w:noProof/>
                 <w:webHidden/>
               </w:rPr>
-              <w:instrText xml:space="preserve"> PAGEREF _Toc228358944 \h </w:instrText>
+              <w:instrText xml:space="preserve"> PAGEREF _Toc228382391 \h </w:instrText>
             </w:r>
             <w:r>
               <w:rPr>
@@ -624,7 +626,7 @@
                 <w:noProof/>
                 <w:webHidden/>
               </w:rPr>
-              <w:t>4</w:t>
+              <w:t>3</w:t>
             </w:r>
             <w:r>
               <w:rPr>
@@ -646,7 +648,7 @@
               <w:lang w:eastAsia="zh-CN"/>
             </w:rPr>
           </w:pPr>
-          <w:hyperlink w:anchor="_Toc228358945" w:history="1">
+          <w:hyperlink w:anchor="_Toc228382392" w:history="1">
             <w:r>
               <w:rPr>
                 <w:rStyle w:val="Hyperlink"/>
@@ -673,7 +675,7 @@
                 <w:noProof/>
                 <w:webHidden/>
               </w:rPr>
-              <w:instrText xml:space="preserve"> PAGEREF _Toc228358945 \h </w:instrText>
+              <w:instrText xml:space="preserve"> PAGEREF _Toc228382392 \h </w:instrText>
             </w:r>
             <w:r>
               <w:rPr>
@@ -715,7 +717,7 @@
               <w:lang w:eastAsia="zh-CN"/>
             </w:rPr>
           </w:pPr>
-          <w:hyperlink w:anchor="_Toc228358946" w:history="1">
+          <w:hyperlink w:anchor="_Toc228382393" w:history="1">
             <w:r>
               <w:rPr>
                 <w:rStyle w:val="Hyperlink"/>
@@ -742,7 +744,7 @@
                 <w:noProof/>
                 <w:webHidden/>
               </w:rPr>
-              <w:instrText xml:space="preserve"> PAGEREF _Toc228358946 \h </w:instrText>
+              <w:instrText xml:space="preserve"> PAGEREF _Toc228382393 \h </w:instrText>
             </w:r>
             <w:r>
               <w:rPr>
@@ -784,7 +786,7 @@
               <w:lang w:eastAsia="zh-CN"/>
             </w:rPr>
           </w:pPr>
-          <w:hyperlink w:anchor="_Toc228358947" w:history="1">
+          <w:hyperlink w:anchor="_Toc228382394" w:history="1">
             <w:r>
               <w:rPr>
                 <w:rStyle w:val="Hyperlink"/>
@@ -811,7 +813,7 @@
                 <w:noProof/>
                 <w:webHidden/>
               </w:rPr>
-              <w:instrText xml:space="preserve"> PAGEREF _Toc228358947 \h </w:instrText>
+              <w:instrText xml:space="preserve"> PAGEREF _Toc228382394 \h </w:instrText>
             </w:r>
             <w:r>
               <w:rPr>
@@ -831,7 +833,7 @@
                 <w:noProof/>
                 <w:webHidden/>
               </w:rPr>
-              <w:t>5</w:t>
+              <w:t>4</w:t>
             </w:r>
             <w:r>
               <w:rPr>
@@ -853,7 +855,7 @@
               <w:lang w:eastAsia="zh-CN"/>
             </w:rPr>
           </w:pPr>
-          <w:hyperlink w:anchor="_Toc228358948" w:history="1">
+          <w:hyperlink w:anchor="_Toc228382395" w:history="1">
             <w:r>
               <w:rPr>
                 <w:rStyle w:val="Hyperlink"/>
@@ -880,7 +882,7 @@
                 <w:noProof/>
                 <w:webHidden/>
               </w:rPr>
-              <w:instrText xml:space="preserve"> PAGEREF _Toc228358948 \h </w:instrText>
+              <w:instrText xml:space="preserve"> PAGEREF _Toc228382395 \h </w:instrText>
             </w:r>
             <w:r>
               <w:rPr>
@@ -900,7 +902,7 @@
                 <w:noProof/>
                 <w:webHidden/>
               </w:rPr>
-              <w:t>5</w:t>
+              <w:t>4</w:t>
             </w:r>
             <w:r>
               <w:rPr>
@@ -944,23 +946,23 @@
     </w:p>
     <w:p>
       <w:pPr>
-        <w:pStyle w:val="TOCHeading"/>
-      </w:pPr>
-    </w:p>
-    <w:p>
-      <w:pPr>
         <w:pStyle w:val="Heading1"/>
+        <w:numPr>
+          <w:ilvl w:val="0"/>
+          <w:numId w:val="2"/>
+        </w:numPr>
         <w:rPr>
           <w:lang w:val="en-US"/>
         </w:rPr>
       </w:pPr>
       <w:bookmarkStart w:id="0" w:name="_Toc228358824"/>
       <w:bookmarkStart w:id="1" w:name="_Toc228358900"/>
-      <w:bookmarkStart w:id="2" w:name="_Toc228358939"/>
+      <w:bookmarkStart w:id="2" w:name="_Toc228382386"/>
       <w:r>
         <w:rPr>
           <w:lang w:val="en-US"/>
         </w:rPr>
+        <w:lastRenderedPageBreak/>
         <w:t>Introduction</w:t>
       </w:r>
       <w:bookmarkEnd w:id="0"/>
@@ -973,31 +975,21 @@
           <w:lang w:val="en-US"/>
         </w:rPr>
       </w:pPr>
-      <w:r>
-        <w:rPr>
-          <w:lang w:val="en-US"/>
-        </w:rPr>
-        <w:t>Hello</w:t>
-      </w:r>
     </w:p>
     <w:p>
       <w:pPr>
         <w:pStyle w:val="Heading1"/>
-        <w:rPr>
-          <w:lang w:val="en-US"/>
-        </w:rPr>
-      </w:pPr>
-    </w:p>
-    <w:p>
-      <w:pPr>
-        <w:pStyle w:val="Heading1"/>
+        <w:numPr>
+          <w:ilvl w:val="0"/>
+          <w:numId w:val="2"/>
+        </w:numPr>
         <w:rPr>
           <w:lang w:val="en-US"/>
         </w:rPr>
       </w:pPr>
       <w:bookmarkStart w:id="3" w:name="_Toc228358825"/>
       <w:bookmarkStart w:id="4" w:name="_Toc228358901"/>
-      <w:bookmarkStart w:id="5" w:name="_Toc228358940"/>
+      <w:bookmarkStart w:id="5" w:name="_Toc228382387"/>
       <w:r>
         <w:rPr>
           <w:lang w:val="en-US"/>
@@ -1010,19 +1002,82 @@
     </w:p>
     <w:p>
       <w:pPr>
+        <w:pStyle w:val="Heading2"/>
+        <w:numPr>
+          <w:ilvl w:val="1"/>
+          <w:numId w:val="2"/>
+        </w:numPr>
+        <w:rPr>
+          <w:lang w:val="en-US"/>
+        </w:rPr>
+      </w:pPr>
+      <w:r>
+        <w:rPr>
+          <w:lang w:val="en-US"/>
+        </w:rPr>
+        <w:t>Fred’s Model Architectures</w:t>
+      </w:r>
+    </w:p>
+    <w:p>
+      <w:r>
+        <w:rPr>
+          <w:b/>
+          <w:bCs/>
+        </w:rPr>
+        <w:t>One-step</w:t>
+      </w:r>
+    </w:p>
+    <w:p>
+      <w:r>
+        <w:drawing>
+          <wp:inline distT="0" distB="0" distL="0" distR="0" wp14:anchorId="7CD4F9C0" wp14:editId="56F9B344">
+            <wp:extent cx="3070904" cy="4320565"/>
+            <wp:effectExtent l="0" t="0" r="0" b="3810"/>
+            <wp:docPr id="1745460433" name="Picture 1"/>
+            <wp:cNvGraphicFramePr>
+              <a:graphicFrameLocks xmlns:a="http://schemas.openxmlformats.org/drawingml/2006/main" noChangeAspect="1"/>
+            </wp:cNvGraphicFramePr>
+            <a:graphic xmlns:a="http://schemas.openxmlformats.org/drawingml/2006/main">
+              <a:graphicData uri="http://schemas.openxmlformats.org/drawingml/2006/picture">
+                <pic:pic xmlns:pic="http://schemas.openxmlformats.org/drawingml/2006/picture">
+                  <pic:nvPicPr>
+                    <pic:cNvPr id="1745460433" name=""/>
+                    <pic:cNvPicPr/>
+                  </pic:nvPicPr>
+                  <pic:blipFill>
+                    <a:blip r:embed="rId6"/>
+                    <a:stretch>
+                      <a:fillRect/>
+                    </a:stretch>
+                  </pic:blipFill>
+                  <pic:spPr>
+                    <a:xfrm>
+                      <a:off x="0" y="0"/>
+                      <a:ext cx="3082314" cy="4336618"/>
+                    </a:xfrm>
+                    <a:prstGeom prst="rect">
+                      <a:avLst/>
+                    </a:prstGeom>
+                  </pic:spPr>
+                </pic:pic>
+              </a:graphicData>
+            </a:graphic>
+          </wp:inline>
+        </w:drawing>
+      </w:r>
+    </w:p>
+    <w:p/>
+    <w:p>
+      <w:pPr>
         <w:pStyle w:val="Heading1"/>
-        <w:rPr>
-          <w:lang w:val="en-US"/>
-        </w:rPr>
-      </w:pPr>
-    </w:p>
-    <w:p>
-      <w:pPr>
-        <w:pStyle w:val="Heading1"/>
+        <w:numPr>
+          <w:ilvl w:val="0"/>
+          <w:numId w:val="2"/>
+        </w:numPr>
       </w:pPr>
       <w:bookmarkStart w:id="6" w:name="_Toc228358826"/>
       <w:bookmarkStart w:id="7" w:name="_Toc228358902"/>
-      <w:bookmarkStart w:id="8" w:name="_Toc228358941"/>
+      <w:bookmarkStart w:id="8" w:name="_Toc228382388"/>
       <w:r>
         <w:t>Data collection and annotation</w:t>
       </w:r>
@@ -1030,18 +1085,18 @@
       <w:bookmarkEnd w:id="7"/>
       <w:bookmarkEnd w:id="8"/>
     </w:p>
+    <w:p/>
     <w:p>
       <w:pPr>
         <w:pStyle w:val="Heading1"/>
-      </w:pPr>
-    </w:p>
-    <w:p>
-      <w:pPr>
-        <w:pStyle w:val="Heading1"/>
+        <w:numPr>
+          <w:ilvl w:val="0"/>
+          <w:numId w:val="2"/>
+        </w:numPr>
       </w:pPr>
       <w:bookmarkStart w:id="9" w:name="_Toc228358827"/>
       <w:bookmarkStart w:id="10" w:name="_Toc228358903"/>
-      <w:bookmarkStart w:id="11" w:name="_Toc228358942"/>
+      <w:bookmarkStart w:id="11" w:name="_Toc228382389"/>
       <w:r>
         <w:t>Implemented machine learning techniques for people detection and fall recognition</w:t>
       </w:r>
@@ -1049,37 +1104,38 @@
       <w:bookmarkEnd w:id="10"/>
       <w:bookmarkEnd w:id="11"/>
     </w:p>
+    <w:p/>
     <w:p>
       <w:pPr>
         <w:pStyle w:val="Heading1"/>
-      </w:pPr>
-    </w:p>
-    <w:p>
-      <w:pPr>
-        <w:pStyle w:val="Heading1"/>
+        <w:numPr>
+          <w:ilvl w:val="0"/>
+          <w:numId w:val="2"/>
+        </w:numPr>
       </w:pPr>
       <w:bookmarkStart w:id="12" w:name="_Toc228358828"/>
       <w:bookmarkStart w:id="13" w:name="_Toc228358904"/>
-      <w:bookmarkStart w:id="14" w:name="_Toc228358943"/>
-      <w:r>
-        <w:t>Scenarios/examples to demonstrate how the system works,</w:t>
+      <w:bookmarkStart w:id="14" w:name="_Toc228382390"/>
+      <w:r>
+        <w:lastRenderedPageBreak/>
+        <w:t>Scenarios/examples to demonstrate how the system works</w:t>
       </w:r>
       <w:bookmarkEnd w:id="12"/>
       <w:bookmarkEnd w:id="13"/>
       <w:bookmarkEnd w:id="14"/>
     </w:p>
+    <w:p/>
     <w:p>
       <w:pPr>
         <w:pStyle w:val="Heading1"/>
-      </w:pPr>
-    </w:p>
-    <w:p>
-      <w:pPr>
-        <w:pStyle w:val="Heading1"/>
+        <w:numPr>
+          <w:ilvl w:val="0"/>
+          <w:numId w:val="2"/>
+        </w:numPr>
       </w:pPr>
       <w:bookmarkStart w:id="15" w:name="_Toc228358829"/>
       <w:bookmarkStart w:id="16" w:name="_Toc228358905"/>
-      <w:bookmarkStart w:id="17" w:name="_Toc228358944"/>
+      <w:bookmarkStart w:id="17" w:name="_Toc228382391"/>
       <w:r>
         <w:t>Some critical analysis of the implementation</w:t>
       </w:r>
@@ -1089,16 +1145,227 @@
     </w:p>
     <w:p>
       <w:pPr>
+        <w:pStyle w:val="Heading2"/>
+        <w:numPr>
+          <w:ilvl w:val="1"/>
+          <w:numId w:val="2"/>
+        </w:numPr>
+      </w:pPr>
+      <w:r>
+        <w:t>Fred’s models</w:t>
+      </w:r>
+    </w:p>
+    <w:p>
+      <w:pPr>
+        <w:rPr>
+          <w:b/>
+          <w:bCs/>
+        </w:rPr>
+      </w:pPr>
+      <w:r>
+        <w:rPr>
+          <w:b/>
+          <w:bCs/>
+        </w:rPr>
+        <w:t>One-step</w:t>
+      </w:r>
+    </w:p>
+    <w:p>
+      <w:pPr>
+        <w:jc w:val="center"/>
+      </w:pPr>
+      <w:r>
+        <w:drawing>
+          <wp:inline distT="0" distB="0" distL="0" distR="0" wp14:anchorId="2C90F7F9" wp14:editId="5C2E15AE">
+            <wp:extent cx="1565139" cy="1319757"/>
+            <wp:effectExtent l="0" t="0" r="0" b="0"/>
+            <wp:docPr id="556091842" name="Picture 1"/>
+            <wp:cNvGraphicFramePr>
+              <a:graphicFrameLocks xmlns:a="http://schemas.openxmlformats.org/drawingml/2006/main" noChangeAspect="1"/>
+            </wp:cNvGraphicFramePr>
+            <a:graphic xmlns:a="http://schemas.openxmlformats.org/drawingml/2006/main">
+              <a:graphicData uri="http://schemas.openxmlformats.org/drawingml/2006/picture">
+                <pic:pic xmlns:pic="http://schemas.openxmlformats.org/drawingml/2006/picture">
+                  <pic:nvPicPr>
+                    <pic:cNvPr id="556091842" name=""/>
+                    <pic:cNvPicPr/>
+                  </pic:nvPicPr>
+                  <pic:blipFill>
+                    <a:blip r:embed="rId7"/>
+                    <a:stretch>
+                      <a:fillRect/>
+                    </a:stretch>
+                  </pic:blipFill>
+                  <pic:spPr>
+                    <a:xfrm>
+                      <a:off x="0" y="0"/>
+                      <a:ext cx="1567812" cy="1322011"/>
+                    </a:xfrm>
+                    <a:prstGeom prst="rect">
+                      <a:avLst/>
+                    </a:prstGeom>
+                  </pic:spPr>
+                </pic:pic>
+              </a:graphicData>
+            </a:graphic>
+          </wp:inline>
+        </w:drawing>
+      </w:r>
+    </w:p>
+    <w:p>
+      <w:r>
+        <w:t xml:space="preserve">The custom </w:t>
+      </w:r>
+      <w:r>
+        <w:t>convolutional neural network (CNN)</w:t>
+      </w:r>
+      <w:r>
+        <w:t xml:space="preserve"> </w:t>
+      </w:r>
+      <w:r>
+        <w:t xml:space="preserve">solution employed by Frederick </w:t>
+      </w:r>
+      <w:r>
+        <w:t xml:space="preserve">shows </w:t>
+      </w:r>
+      <w:r>
+        <w:t xml:space="preserve">poor performance, likely due to </w:t>
+      </w:r>
+      <w:r>
+        <w:t>not having enough samples to train and test with, or the samples are too visually similar.</w:t>
+      </w:r>
+      <w:r>
+        <w:t xml:space="preserve"> The </w:t>
+      </w:r>
+      <w:r>
+        <w:t xml:space="preserve">poor performance is backed up by the above image, showing the Average Precision of two models trained: one custom CNN built from scratch, and the other a </w:t>
+      </w:r>
+      <w:r>
+        <w:t xml:space="preserve">CNN </w:t>
+      </w:r>
+      <w:r>
+        <w:t xml:space="preserve">transfer learning </w:t>
+      </w:r>
+      <w:r>
+        <w:t xml:space="preserve">model based on ImageNet. </w:t>
+      </w:r>
+    </w:p>
+    <w:p>
+      <w:r>
+        <w:t xml:space="preserve">According to these statistics, the custom CNN model does not </w:t>
+      </w:r>
+      <w:r>
+        <w:t xml:space="preserve">learn much at all, and only slightly detects falls, while completely failing at walk or sit. The </w:t>
+      </w:r>
+      <w:r>
+        <w:t xml:space="preserve">transfer learning CNN model does not fare much better, however it does prove that </w:t>
+      </w:r>
+      <w:r>
+        <w:t xml:space="preserve">transfer learning does indeed work, as it sees a 3x improvement over the custom CNN model. </w:t>
+      </w:r>
+    </w:p>
+    <w:p>
+      <w:pPr>
+        <w:jc w:val="center"/>
+      </w:pPr>
+      <w:r>
+        <w:rPr>
+          <w:noProof/>
+        </w:rPr>
+        <w:drawing>
+          <wp:inline distT="0" distB="0" distL="0" distR="0" wp14:anchorId="17B2AED5" wp14:editId="42E26CDB">
+            <wp:extent cx="4717855" cy="1810619"/>
+            <wp:effectExtent l="0" t="0" r="6985" b="0"/>
+            <wp:docPr id="702203820" name="Picture 1"/>
+            <wp:cNvGraphicFramePr>
+              <a:graphicFrameLocks xmlns:a="http://schemas.openxmlformats.org/drawingml/2006/main" noChangeAspect="1"/>
+            </wp:cNvGraphicFramePr>
+            <a:graphic xmlns:a="http://schemas.openxmlformats.org/drawingml/2006/main">
+              <a:graphicData uri="http://schemas.openxmlformats.org/drawingml/2006/picture">
+                <pic:pic xmlns:pic="http://schemas.openxmlformats.org/drawingml/2006/picture">
+                  <pic:nvPicPr>
+                    <pic:cNvPr id="0" name="Picture 1"/>
+                    <pic:cNvPicPr>
+                      <a:picLocks noChangeAspect="1" noChangeArrowheads="1"/>
+                    </pic:cNvPicPr>
+                  </pic:nvPicPr>
+                  <pic:blipFill>
+                    <a:blip r:embed="rId8" cstate="print">
+                      <a:extLst>
+                        <a:ext uri="{28A0092B-C50C-407E-A947-70E740481C1C}">
+                          <a14:useLocalDpi xmlns:a14="http://schemas.microsoft.com/office/drawing/2010/main" val="0"/>
+                        </a:ext>
+                      </a:extLst>
+                    </a:blip>
+                    <a:srcRect/>
+                    <a:stretch>
+                      <a:fillRect/>
+                    </a:stretch>
+                  </pic:blipFill>
+                  <pic:spPr bwMode="auto">
+                    <a:xfrm>
+                      <a:off x="0" y="0"/>
+                      <a:ext cx="4744275" cy="1820758"/>
+                    </a:xfrm>
+                    <a:prstGeom prst="rect">
+                      <a:avLst/>
+                    </a:prstGeom>
+                    <a:noFill/>
+                    <a:ln>
+                      <a:noFill/>
+                    </a:ln>
+                  </pic:spPr>
+                </pic:pic>
+              </a:graphicData>
+            </a:graphic>
+          </wp:inline>
+        </w:drawing>
+      </w:r>
+    </w:p>
+    <w:p>
+      <w:r>
+        <w:t xml:space="preserve">Overall, the two one-step models seem to be behaving as a binary classifier rather than a </w:t>
+      </w:r>
+      <w:r>
+        <w:t>multi-class classifier</w:t>
+      </w:r>
+      <w:r>
+        <w:t>, and this can be explained by viewing the above graph of the models’ average precisions for each of the classes</w:t>
+      </w:r>
+      <w:r>
+        <w:t xml:space="preserve">, and we can tell that walk and sit is </w:t>
+      </w:r>
+      <w:r>
+        <w:lastRenderedPageBreak/>
+        <w:t>not being learned, if at all.</w:t>
+      </w:r>
+      <w:r>
+        <w:t xml:space="preserve"> As it stands, this model is correctly a “fall detector” but it </w:t>
+      </w:r>
+      <w:r>
+        <w:t>is not a multi-class activity detector</w:t>
+      </w:r>
+      <w:r>
+        <w:t>.</w:t>
+      </w:r>
+    </w:p>
+    <w:p/>
+    <w:p>
+      <w:pPr>
+        <w:pStyle w:val="Heading3"/>
+      </w:pPr>
+    </w:p>
+    <w:p>
+      <w:pPr>
         <w:pStyle w:val="Heading1"/>
-      </w:pPr>
-    </w:p>
-    <w:p>
-      <w:pPr>
-        <w:pStyle w:val="Heading1"/>
+        <w:numPr>
+          <w:ilvl w:val="0"/>
+          <w:numId w:val="2"/>
+        </w:numPr>
       </w:pPr>
       <w:bookmarkStart w:id="18" w:name="_Toc228358830"/>
       <w:bookmarkStart w:id="19" w:name="_Toc228358906"/>
-      <w:bookmarkStart w:id="20" w:name="_Toc228358945"/>
+      <w:bookmarkStart w:id="20" w:name="_Toc228382392"/>
       <w:r>
         <w:t>Practical application description</w:t>
       </w:r>
@@ -1114,10 +1381,14 @@
     <w:p>
       <w:pPr>
         <w:pStyle w:val="Heading1"/>
+        <w:numPr>
+          <w:ilvl w:val="0"/>
+          <w:numId w:val="2"/>
+        </w:numPr>
       </w:pPr>
       <w:bookmarkStart w:id="21" w:name="_Toc228358831"/>
       <w:bookmarkStart w:id="22" w:name="_Toc228358907"/>
-      <w:bookmarkStart w:id="23" w:name="_Toc228358946"/>
+      <w:bookmarkStart w:id="23" w:name="_Toc228382393"/>
       <w:r>
         <w:t>Summary/Conclusion</w:t>
       </w:r>
@@ -1133,10 +1404,14 @@
     <w:p>
       <w:pPr>
         <w:pStyle w:val="Heading1"/>
+        <w:numPr>
+          <w:ilvl w:val="0"/>
+          <w:numId w:val="2"/>
+        </w:numPr>
       </w:pPr>
       <w:bookmarkStart w:id="24" w:name="_Toc228358832"/>
       <w:bookmarkStart w:id="25" w:name="_Toc228358908"/>
-      <w:bookmarkStart w:id="26" w:name="_Toc228358947"/>
+      <w:bookmarkStart w:id="26" w:name="_Toc228382394"/>
       <w:r>
         <w:t>Presentation + demo video link</w:t>
       </w:r>
@@ -1165,12 +1440,9 @@
       </w:pPr>
       <w:bookmarkStart w:id="27" w:name="_Toc228358833"/>
       <w:bookmarkStart w:id="28" w:name="_Toc228358909"/>
-      <w:bookmarkStart w:id="29" w:name="_Toc228358948"/>
-      <w:r>
-        <w:t>10.</w:t>
-      </w:r>
-      <w:r>
-        <w:t xml:space="preserve"> References</w:t>
+      <w:bookmarkStart w:id="29" w:name="_Toc228382395"/>
+      <w:r>
+        <w:t>References</w:t>
       </w:r>
       <w:bookmarkEnd w:id="27"/>
       <w:bookmarkEnd w:id="28"/>
@@ -1189,6 +1461,276 @@
 <file path=word/numbering.xml><?xml version="1.0" encoding="utf-8"?>
 <w:numbering xmlns:wpc="http://schemas.microsoft.com/office/word/2010/wordprocessingCanvas" xmlns:cx="http://schemas.microsoft.com/office/drawing/2014/chartex" xmlns:cx1="http://schemas.microsoft.com/office/drawing/2015/9/8/chartex" xmlns:cx2="http://schemas.microsoft.com/office/drawing/2015/10/21/chartex" xmlns:cx3="http://schemas.microsoft.com/office/drawing/2016/5/9/chartex" xmlns:cx4="http://schemas.microsoft.com/office/drawing/2016/5/10/chartex" xmlns:cx5="http://schemas.microsoft.com/office/drawing/2016/5/11/chartex" xmlns:cx6="http://schemas.microsoft.com/office/drawing/2016/5/12/chartex" xmlns:cx7="http://schemas.microsoft.com/office/drawing/2016/5/13/chartex" xmlns:cx8="http://schemas.microsoft.com/office/drawing/2016/5/14/chartex" xmlns:mc="http://schemas.openxmlformats.org/markup-compatibility/2006" xmlns:aink="http://schemas.microsoft.com/office/drawing/2016/ink" xmlns:am3d="http://schemas.microsoft.com/office/drawing/2017/model3d" xmlns:o="urn:schemas-microsoft-com:office:office" xmlns:oel="http://schemas.microsoft.com/office/2019/extlst" xmlns:r="http://schemas.openxmlformats.org/officeDocument/2006/relationships" xmlns:m="http://schemas.openxmlformats.org/officeDocument/2006/math" xmlns:v="urn:schemas-microsoft-com:vml" xmlns:wp14="http://schemas.microsoft.com/office/word/2010/wordprocessingDrawing" xmlns:wp="http://schemas.openxmlformats.org/drawingml/2006/wordprocessingDrawing" xmlns:w10="urn:schemas-microsoft-com:office:word" xmlns:w="http://schemas.openxmlformats.org/wordprocessingml/2006/main" xmlns:w14="http://schemas.microsoft.com/office/word/2010/wordml" xmlns:w15="http://schemas.microsoft.com/office/word/2012/wordml" xmlns:w16cex="http://schemas.microsoft.com/office/word/2018/wordml/cex" xmlns:w16cid="http://schemas.microsoft.com/office/word/2016/wordml/cid" xmlns:w16="http://schemas.microsoft.com/office/word/2018/wordml" xmlns:w16du="http://schemas.microsoft.com/office/word/2023/wordml/word16du" xmlns:w16sdtdh="http://schemas.microsoft.com/office/word/2020/wordml/sdtdatahash" xmlns:w16sdtfl="http://schemas.microsoft.com/office/word/2024/wordml/sdtformatlock" xmlns:w16se="http://schemas.microsoft.com/office/word/2015/wordml/symex" xmlns:wpg="http://schemas.microsoft.com/office/word/2010/wordprocessingGroup" xmlns:wpi="http://schemas.microsoft.com/office/word/2010/wordprocessingInk" xmlns:wne="http://schemas.microsoft.com/office/word/2006/wordml" xmlns:wps="http://schemas.microsoft.com/office/word/2010/wordprocessingShape" mc:Ignorable="w14 w15 w16se w16cid w16 w16cex w16sdtdh w16sdtfl w16du wp14">
   <w:abstractNum w:abstractNumId="0" w15:restartNumberingAfterBreak="0">
+    <w:nsid w:val="19A20A94"/>
+    <w:multiLevelType w:val="multilevel"/>
+    <w:tmpl w:val="F0185946"/>
+    <w:lvl w:ilvl="0">
+      <w:start w:val="1"/>
+      <w:numFmt w:val="bullet"/>
+      <w:lvlText w:val=""/>
+      <w:lvlJc w:val="left"/>
+      <w:pPr>
+        <w:tabs>
+          <w:tab w:val="num" w:pos="720"/>
+        </w:tabs>
+        <w:ind w:left="720" w:hanging="360"/>
+      </w:pPr>
+      <w:rPr>
+        <w:rFonts w:ascii="Symbol" w:hAnsi="Symbol" w:hint="default"/>
+        <w:sz w:val="20"/>
+      </w:rPr>
+    </w:lvl>
+    <w:lvl w:ilvl="1" w:tentative="1">
+      <w:start w:val="1"/>
+      <w:numFmt w:val="bullet"/>
+      <w:lvlText w:val=""/>
+      <w:lvlJc w:val="left"/>
+      <w:pPr>
+        <w:tabs>
+          <w:tab w:val="num" w:pos="1440"/>
+        </w:tabs>
+        <w:ind w:left="1440" w:hanging="360"/>
+      </w:pPr>
+      <w:rPr>
+        <w:rFonts w:ascii="Symbol" w:hAnsi="Symbol" w:hint="default"/>
+        <w:sz w:val="20"/>
+      </w:rPr>
+    </w:lvl>
+    <w:lvl w:ilvl="2" w:tentative="1">
+      <w:start w:val="1"/>
+      <w:numFmt w:val="bullet"/>
+      <w:lvlText w:val=""/>
+      <w:lvlJc w:val="left"/>
+      <w:pPr>
+        <w:tabs>
+          <w:tab w:val="num" w:pos="2160"/>
+        </w:tabs>
+        <w:ind w:left="2160" w:hanging="360"/>
+      </w:pPr>
+      <w:rPr>
+        <w:rFonts w:ascii="Symbol" w:hAnsi="Symbol" w:hint="default"/>
+        <w:sz w:val="20"/>
+      </w:rPr>
+    </w:lvl>
+    <w:lvl w:ilvl="3" w:tentative="1">
+      <w:start w:val="1"/>
+      <w:numFmt w:val="bullet"/>
+      <w:lvlText w:val=""/>
+      <w:lvlJc w:val="left"/>
+      <w:pPr>
+        <w:tabs>
+          <w:tab w:val="num" w:pos="2880"/>
+        </w:tabs>
+        <w:ind w:left="2880" w:hanging="360"/>
+      </w:pPr>
+      <w:rPr>
+        <w:rFonts w:ascii="Symbol" w:hAnsi="Symbol" w:hint="default"/>
+        <w:sz w:val="20"/>
+      </w:rPr>
+    </w:lvl>
+    <w:lvl w:ilvl="4" w:tentative="1">
+      <w:start w:val="1"/>
+      <w:numFmt w:val="bullet"/>
+      <w:lvlText w:val=""/>
+      <w:lvlJc w:val="left"/>
+      <w:pPr>
+        <w:tabs>
+          <w:tab w:val="num" w:pos="3600"/>
+        </w:tabs>
+        <w:ind w:left="3600" w:hanging="360"/>
+      </w:pPr>
+      <w:rPr>
+        <w:rFonts w:ascii="Symbol" w:hAnsi="Symbol" w:hint="default"/>
+        <w:sz w:val="20"/>
+      </w:rPr>
+    </w:lvl>
+    <w:lvl w:ilvl="5" w:tentative="1">
+      <w:start w:val="1"/>
+      <w:numFmt w:val="bullet"/>
+      <w:lvlText w:val=""/>
+      <w:lvlJc w:val="left"/>
+      <w:pPr>
+        <w:tabs>
+          <w:tab w:val="num" w:pos="4320"/>
+        </w:tabs>
+        <w:ind w:left="4320" w:hanging="360"/>
+      </w:pPr>
+      <w:rPr>
+        <w:rFonts w:ascii="Symbol" w:hAnsi="Symbol" w:hint="default"/>
+        <w:sz w:val="20"/>
+      </w:rPr>
+    </w:lvl>
+    <w:lvl w:ilvl="6" w:tentative="1">
+      <w:start w:val="1"/>
+      <w:numFmt w:val="bullet"/>
+      <w:lvlText w:val=""/>
+      <w:lvlJc w:val="left"/>
+      <w:pPr>
+        <w:tabs>
+          <w:tab w:val="num" w:pos="5040"/>
+        </w:tabs>
+        <w:ind w:left="5040" w:hanging="360"/>
+      </w:pPr>
+      <w:rPr>
+        <w:rFonts w:ascii="Symbol" w:hAnsi="Symbol" w:hint="default"/>
+        <w:sz w:val="20"/>
+      </w:rPr>
+    </w:lvl>
+    <w:lvl w:ilvl="7" w:tentative="1">
+      <w:start w:val="1"/>
+      <w:numFmt w:val="bullet"/>
+      <w:lvlText w:val=""/>
+      <w:lvlJc w:val="left"/>
+      <w:pPr>
+        <w:tabs>
+          <w:tab w:val="num" w:pos="5760"/>
+        </w:tabs>
+        <w:ind w:left="5760" w:hanging="360"/>
+      </w:pPr>
+      <w:rPr>
+        <w:rFonts w:ascii="Symbol" w:hAnsi="Symbol" w:hint="default"/>
+        <w:sz w:val="20"/>
+      </w:rPr>
+    </w:lvl>
+    <w:lvl w:ilvl="8" w:tentative="1">
+      <w:start w:val="1"/>
+      <w:numFmt w:val="bullet"/>
+      <w:lvlText w:val=""/>
+      <w:lvlJc w:val="left"/>
+      <w:pPr>
+        <w:tabs>
+          <w:tab w:val="num" w:pos="6480"/>
+        </w:tabs>
+        <w:ind w:left="6480" w:hanging="360"/>
+      </w:pPr>
+      <w:rPr>
+        <w:rFonts w:ascii="Symbol" w:hAnsi="Symbol" w:hint="default"/>
+        <w:sz w:val="20"/>
+      </w:rPr>
+    </w:lvl>
+  </w:abstractNum>
+  <w:abstractNum w:abstractNumId="1" w15:restartNumberingAfterBreak="0">
+    <w:nsid w:val="478923D1"/>
+    <w:multiLevelType w:val="multilevel"/>
+    <w:tmpl w:val="67DE31DC"/>
+    <w:lvl w:ilvl="0">
+      <w:start w:val="1"/>
+      <w:numFmt w:val="decimal"/>
+      <w:lvlText w:val="%1."/>
+      <w:lvlJc w:val="left"/>
+      <w:pPr>
+        <w:ind w:left="720" w:hanging="360"/>
+      </w:pPr>
+      <w:rPr>
+        <w:rFonts w:hint="default"/>
+      </w:rPr>
+    </w:lvl>
+    <w:lvl w:ilvl="1">
+      <w:start w:val="1"/>
+      <w:numFmt w:val="decimal"/>
+      <w:isLgl/>
+      <w:lvlText w:val="%1.%2."/>
+      <w:lvlJc w:val="left"/>
+      <w:pPr>
+        <w:ind w:left="1080" w:hanging="720"/>
+      </w:pPr>
+      <w:rPr>
+        <w:rFonts w:hint="default"/>
+      </w:rPr>
+    </w:lvl>
+    <w:lvl w:ilvl="2">
+      <w:start w:val="1"/>
+      <w:numFmt w:val="decimal"/>
+      <w:isLgl/>
+      <w:lvlText w:val="%1.%2.%3."/>
+      <w:lvlJc w:val="left"/>
+      <w:pPr>
+        <w:ind w:left="1440" w:hanging="1080"/>
+      </w:pPr>
+      <w:rPr>
+        <w:rFonts w:hint="default"/>
+      </w:rPr>
+    </w:lvl>
+    <w:lvl w:ilvl="3">
+      <w:start w:val="1"/>
+      <w:numFmt w:val="decimal"/>
+      <w:isLgl/>
+      <w:lvlText w:val="%1.%2.%3.%4."/>
+      <w:lvlJc w:val="left"/>
+      <w:pPr>
+        <w:ind w:left="1440" w:hanging="1080"/>
+      </w:pPr>
+      <w:rPr>
+        <w:rFonts w:hint="default"/>
+      </w:rPr>
+    </w:lvl>
+    <w:lvl w:ilvl="4">
+      <w:start w:val="1"/>
+      <w:numFmt w:val="decimal"/>
+      <w:isLgl/>
+      <w:lvlText w:val="%1.%2.%3.%4.%5."/>
+      <w:lvlJc w:val="left"/>
+      <w:pPr>
+        <w:ind w:left="1800" w:hanging="1440"/>
+      </w:pPr>
+      <w:rPr>
+        <w:rFonts w:hint="default"/>
+      </w:rPr>
+    </w:lvl>
+    <w:lvl w:ilvl="5">
+      <w:start w:val="1"/>
+      <w:numFmt w:val="decimal"/>
+      <w:isLgl/>
+      <w:lvlText w:val="%1.%2.%3.%4.%5.%6."/>
+      <w:lvlJc w:val="left"/>
+      <w:pPr>
+        <w:ind w:left="2160" w:hanging="1800"/>
+      </w:pPr>
+      <w:rPr>
+        <w:rFonts w:hint="default"/>
+      </w:rPr>
+    </w:lvl>
+    <w:lvl w:ilvl="6">
+      <w:start w:val="1"/>
+      <w:numFmt w:val="decimal"/>
+      <w:isLgl/>
+      <w:lvlText w:val="%1.%2.%3.%4.%5.%6.%7."/>
+      <w:lvlJc w:val="left"/>
+      <w:pPr>
+        <w:ind w:left="2160" w:hanging="1800"/>
+      </w:pPr>
+      <w:rPr>
+        <w:rFonts w:hint="default"/>
+      </w:rPr>
+    </w:lvl>
+    <w:lvl w:ilvl="7">
+      <w:start w:val="1"/>
+      <w:numFmt w:val="decimal"/>
+      <w:isLgl/>
+      <w:lvlText w:val="%1.%2.%3.%4.%5.%6.%7.%8."/>
+      <w:lvlJc w:val="left"/>
+      <w:pPr>
+        <w:ind w:left="2520" w:hanging="2160"/>
+      </w:pPr>
+      <w:rPr>
+        <w:rFonts w:hint="default"/>
+      </w:rPr>
+    </w:lvl>
+    <w:lvl w:ilvl="8">
+      <w:start w:val="1"/>
+      <w:numFmt w:val="decimal"/>
+      <w:isLgl/>
+      <w:lvlText w:val="%1.%2.%3.%4.%5.%6.%7.%8.%9."/>
+      <w:lvlJc w:val="left"/>
+      <w:pPr>
+        <w:ind w:left="2880" w:hanging="2520"/>
+      </w:pPr>
+      <w:rPr>
+        <w:rFonts w:hint="default"/>
+      </w:rPr>
+    </w:lvl>
+  </w:abstractNum>
+  <w:abstractNum w:abstractNumId="2" w15:restartNumberingAfterBreak="0">
     <w:nsid w:val="7FEF4DFF"/>
     <w:multiLevelType w:val="hybridMultilevel"/>
     <w:tmpl w:val="48B48784"/>
@@ -1278,6 +1820,12 @@
     </w:lvl>
   </w:abstractNum>
   <w:num w:numId="1" w16cid:durableId="1991203623">
+    <w:abstractNumId w:val="2"/>
+  </w:num>
+  <w:num w:numId="2" w16cid:durableId="1211650276">
+    <w:abstractNumId w:val="1"/>
+  </w:num>
+  <w:num w:numId="3" w16cid:durableId="880434985">
     <w:abstractNumId w:val="0"/>
   </w:num>
 </w:numbering>
@@ -1711,7 +2259,6 @@
     <w:next w:val="Normal"/>
     <w:link w:val="Heading2Char"/>
     <w:uiPriority w:val="9"/>
-    <w:semiHidden/>
     <w:unhideWhenUsed/>
     <w:qFormat/>
     <w:rsid w:val="004D7953"/>
@@ -1734,7 +2281,6 @@
     <w:next w:val="Normal"/>
     <w:link w:val="Heading3Char"/>
     <w:uiPriority w:val="9"/>
-    <w:semiHidden/>
     <w:unhideWhenUsed/>
     <w:qFormat/>
     <w:rsid w:val="004D7953"/>
@@ -1927,7 +2473,6 @@
     <w:basedOn w:val="DefaultParagraphFont"/>
     <w:link w:val="Heading2"/>
     <w:uiPriority w:val="9"/>
-    <w:semiHidden/>
     <w:rsid w:val="004D7953"/>
     <w:rPr>
       <w:rFonts w:asciiTheme="majorHAnsi" w:eastAsiaTheme="majorEastAsia" w:hAnsiTheme="majorHAnsi" w:cstheme="majorBidi"/>
@@ -1941,7 +2486,6 @@
     <w:basedOn w:val="DefaultParagraphFont"/>
     <w:link w:val="Heading3"/>
     <w:uiPriority w:val="9"/>
-    <w:semiHidden/>
     <w:rsid w:val="004D7953"/>
     <w:rPr>
       <w:rFonts w:eastAsiaTheme="majorEastAsia" w:cstheme="majorBidi"/>

</xml_diff>

<commit_message>
added comments to assignment report to outline what needs to be written
</commit_message>
<xml_diff>
--- a/Assignment Report.docx
+++ b/Assignment Report.docx
@@ -162,6 +162,25 @@
           <w:szCs w:val="36"/>
         </w:rPr>
         <w:t>104395470</w:t>
+      </w:r>
+    </w:p>
+    <w:p>
+      <w:pPr>
+        <w:ind w:left="360"/>
+        <w:jc w:val="center"/>
+        <w:rPr>
+          <w:sz w:val="36"/>
+          <w:szCs w:val="36"/>
+          <w:lang w:val="en-AU"/>
+        </w:rPr>
+      </w:pPr>
+      <w:r>
+        <w:rPr>
+          <w:sz w:val="36"/>
+          <w:szCs w:val="36"/>
+          <w:lang w:val="en-AU"/>
+        </w:rPr>
+        <w:t>Enoch Eren CHUA, 104401704</w:t>
       </w:r>
     </w:p>
     <w:p>
@@ -914,6 +933,13 @@
           </w:hyperlink>
         </w:p>
         <w:p>
+          <w:pPr>
+            <w:rPr>
+              <w:b/>
+              <w:bCs/>
+              <w:noProof/>
+            </w:rPr>
+          </w:pPr>
           <w:r>
             <w:rPr>
               <w:b/>
@@ -926,20 +952,6 @@
       </w:sdtContent>
     </w:sdt>
     <w:p>
-      <w:pPr>
-        <w:rPr>
-          <w:rFonts w:asciiTheme="majorHAnsi" w:eastAsiaTheme="majorEastAsia" w:hAnsiTheme="majorHAnsi" w:cstheme="majorBidi"/>
-          <w:color w:val="0F4761" w:themeColor="accent1" w:themeShade="BF"/>
-          <w:kern w:val="0"/>
-          <w:sz w:val="32"/>
-          <w:szCs w:val="32"/>
-          <w:lang w:val="en-US" w:eastAsia="en-US"/>
-          <w14:ligatures w14:val="none"/>
-        </w:rPr>
-      </w:pPr>
-      <w:r>
-        <w:t>## table does not automatically update for some reason</w:t>
-      </w:r>
       <w:r>
         <w:br w:type="page"/>
       </w:r>
@@ -1029,6 +1041,9 @@
     </w:p>
     <w:p>
       <w:r>
+        <w:rPr>
+          <w:noProof/>
+        </w:rPr>
         <w:drawing>
           <wp:inline distT="0" distB="0" distL="0" distR="0" wp14:anchorId="7CD4F9C0" wp14:editId="56F9B344">
             <wp:extent cx="3070904" cy="4320565"/>
@@ -1085,7 +1100,32 @@
       <w:bookmarkEnd w:id="7"/>
       <w:bookmarkEnd w:id="8"/>
     </w:p>
-    <w:p/>
+    <w:p>
+      <w:r>
+        <w:t xml:space="preserve">## </w:t>
+      </w:r>
+      <w:proofErr w:type="spellStart"/>
+      <w:r>
+        <w:t>nicholina</w:t>
+      </w:r>
+      <w:proofErr w:type="spellEnd"/>
+      <w:r>
+        <w:t xml:space="preserve"> used LabelMe to label the test set</w:t>
+      </w:r>
+    </w:p>
+    <w:p>
+      <w:r>
+        <w:t xml:space="preserve">## Enoch </w:t>
+      </w:r>
+      <w:proofErr w:type="spellStart"/>
+      <w:r>
+        <w:t>webscraped</w:t>
+      </w:r>
+      <w:proofErr w:type="spellEnd"/>
+      <w:r>
+        <w:t xml:space="preserve"> 50 of each class of sit, walk and fall</w:t>
+      </w:r>
+    </w:p>
     <w:p>
       <w:pPr>
         <w:pStyle w:val="Heading1"/>
@@ -1098,13 +1138,18 @@
       <w:bookmarkStart w:id="10" w:name="_Toc228358903"/>
       <w:bookmarkStart w:id="11" w:name="_Toc228382389"/>
       <w:r>
+        <w:lastRenderedPageBreak/>
         <w:t>Implemented machine learning techniques for people detection and fall recognition</w:t>
       </w:r>
       <w:bookmarkEnd w:id="9"/>
       <w:bookmarkEnd w:id="10"/>
       <w:bookmarkEnd w:id="11"/>
     </w:p>
-    <w:p/>
+    <w:p>
+      <w:r>
+        <w:t xml:space="preserve">## </w:t>
+      </w:r>
+    </w:p>
     <w:p>
       <w:pPr>
         <w:pStyle w:val="Heading1"/>
@@ -1117,14 +1162,20 @@
       <w:bookmarkStart w:id="13" w:name="_Toc228358904"/>
       <w:bookmarkStart w:id="14" w:name="_Toc228382390"/>
       <w:r>
-        <w:lastRenderedPageBreak/>
         <w:t>Scenarios/examples to demonstrate how the system works</w:t>
       </w:r>
       <w:bookmarkEnd w:id="12"/>
       <w:bookmarkEnd w:id="13"/>
       <w:bookmarkEnd w:id="14"/>
     </w:p>
-    <w:p/>
+    <w:p>
+      <w:r>
+        <w:t xml:space="preserve">## </w:t>
+      </w:r>
+      <w:r>
+        <w:t>sample images and detections, and why it detects</w:t>
+      </w:r>
+    </w:p>
     <w:p>
       <w:pPr>
         <w:pStyle w:val="Heading1"/>
@@ -1175,6 +1226,9 @@
         <w:jc w:val="center"/>
       </w:pPr>
       <w:r>
+        <w:rPr>
+          <w:noProof/>
+        </w:rPr>
         <w:drawing>
           <wp:inline distT="0" distB="0" distL="0" distR="0" wp14:anchorId="2C90F7F9" wp14:editId="5C2E15AE">
             <wp:extent cx="1565139" cy="1319757"/>
@@ -1272,6 +1326,7 @@
         <w:rPr>
           <w:noProof/>
         </w:rPr>
+        <w:lastRenderedPageBreak/>
         <w:drawing>
           <wp:inline distT="0" distB="0" distL="0" distR="0" wp14:anchorId="17B2AED5" wp14:editId="42E26CDB">
             <wp:extent cx="4717855" cy="1810619"/>
@@ -1333,11 +1388,7 @@
         <w:t>, and this can be explained by viewing the above graph of the models’ average precisions for each of the classes</w:t>
       </w:r>
       <w:r>
-        <w:t xml:space="preserve">, and we can tell that walk and sit is </w:t>
-      </w:r>
-      <w:r>
-        <w:lastRenderedPageBreak/>
-        <w:t>not being learned, if at all.</w:t>
+        <w:t>, and we can tell that walk and sit is not being learned, if at all.</w:t>
       </w:r>
       <w:r>
         <w:t xml:space="preserve"> As it stands, this model is correctly a “fall detector” but it </w:t>
@@ -1350,6 +1401,20 @@
       </w:r>
     </w:p>
     <w:p/>
+    <w:p>
+      <w:r>
+        <w:t>## qualitative analysis</w:t>
+      </w:r>
+      <w:r>
+        <w:t xml:space="preserve"> (images and why it always fails for example)</w:t>
+      </w:r>
+      <w:r>
+        <w:t>, quantitative analysis (</w:t>
+      </w:r>
+      <w:r>
+        <w:t>statistics)</w:t>
+      </w:r>
+    </w:p>
     <w:p>
       <w:pPr>
         <w:pStyle w:val="Heading3"/>
@@ -1373,11 +1438,7 @@
       <w:bookmarkEnd w:id="19"/>
       <w:bookmarkEnd w:id="20"/>
     </w:p>
-    <w:p>
-      <w:pPr>
-        <w:pStyle w:val="Heading1"/>
-      </w:pPr>
-    </w:p>
+    <w:p/>
     <w:p>
       <w:pPr>
         <w:pStyle w:val="Heading1"/>
@@ -1397,9 +1458,9 @@
       <w:bookmarkEnd w:id="23"/>
     </w:p>
     <w:p>
-      <w:pPr>
-        <w:pStyle w:val="Heading1"/>
-      </w:pPr>
+      <w:r>
+        <w:t>## example model is the best, because for example: it wins in every case study we do</w:t>
+      </w:r>
     </w:p>
     <w:p>
       <w:pPr>
@@ -1424,16 +1485,9 @@
         <w:pStyle w:val="Heading1"/>
       </w:pPr>
     </w:p>
-    <w:p>
-      <w:pPr>
-        <w:pStyle w:val="Heading1"/>
-      </w:pPr>
-    </w:p>
-    <w:p>
-      <w:pPr>
-        <w:pStyle w:val="Heading1"/>
-      </w:pPr>
-    </w:p>
+    <w:p/>
+    <w:p/>
+    <w:p/>
     <w:p>
       <w:pPr>
         <w:pStyle w:val="Heading1"/>
@@ -1447,6 +1501,45 @@
       <w:bookmarkEnd w:id="27"/>
       <w:bookmarkEnd w:id="28"/>
       <w:bookmarkEnd w:id="29"/>
+    </w:p>
+    <w:p>
+      <w:r>
+        <w:br w:type="page"/>
+      </w:r>
+      <w:r>
+        <w:lastRenderedPageBreak/>
+        <w:t>Questions:</w:t>
+      </w:r>
+      <w:r>
+        <w:br/>
+      </w:r>
+      <w:r>
+        <w:t>I</w:t>
+      </w:r>
+      <w:r>
+        <w:t>s our testing dataset enough</w:t>
+      </w:r>
+    </w:p>
+    <w:p>
+      <w:r>
+        <w:t>Sw</w:t>
+      </w:r>
+      <w:r>
+        <w:t>i</w:t>
+      </w:r>
+      <w:r>
+        <w:t>tching some images from testing to training and back</w:t>
+      </w:r>
+    </w:p>
+    <w:p>
+      <w:pPr>
+        <w:rPr>
+          <w:rFonts w:asciiTheme="majorHAnsi" w:eastAsiaTheme="majorEastAsia" w:hAnsiTheme="majorHAnsi" w:cstheme="majorBidi"/>
+          <w:color w:val="0F4761" w:themeColor="accent1" w:themeShade="BF"/>
+          <w:sz w:val="40"/>
+          <w:szCs w:val="40"/>
+        </w:rPr>
+      </w:pPr>
     </w:p>
     <w:sectPr>
       <w:pgSz w:w="11906" w:h="16838"/>
@@ -1731,6 +1824,119 @@
     </w:lvl>
   </w:abstractNum>
   <w:abstractNum w:abstractNumId="2" w15:restartNumberingAfterBreak="0">
+    <w:nsid w:val="77681A9A"/>
+    <w:multiLevelType w:val="multilevel"/>
+    <w:tmpl w:val="97FC44CE"/>
+    <w:lvl w:ilvl="0">
+      <w:start w:val="1"/>
+      <w:numFmt w:val="decimal"/>
+      <w:lvlText w:val="%1."/>
+      <w:lvlJc w:val="left"/>
+      <w:pPr>
+        <w:tabs>
+          <w:tab w:val="num" w:pos="720"/>
+        </w:tabs>
+        <w:ind w:left="720" w:hanging="360"/>
+      </w:pPr>
+    </w:lvl>
+    <w:lvl w:ilvl="1" w:tentative="1">
+      <w:start w:val="1"/>
+      <w:numFmt w:val="decimal"/>
+      <w:lvlText w:val="%2."/>
+      <w:lvlJc w:val="left"/>
+      <w:pPr>
+        <w:tabs>
+          <w:tab w:val="num" w:pos="1440"/>
+        </w:tabs>
+        <w:ind w:left="1440" w:hanging="360"/>
+      </w:pPr>
+    </w:lvl>
+    <w:lvl w:ilvl="2" w:tentative="1">
+      <w:start w:val="1"/>
+      <w:numFmt w:val="decimal"/>
+      <w:lvlText w:val="%3."/>
+      <w:lvlJc w:val="left"/>
+      <w:pPr>
+        <w:tabs>
+          <w:tab w:val="num" w:pos="2160"/>
+        </w:tabs>
+        <w:ind w:left="2160" w:hanging="360"/>
+      </w:pPr>
+    </w:lvl>
+    <w:lvl w:ilvl="3" w:tentative="1">
+      <w:start w:val="1"/>
+      <w:numFmt w:val="decimal"/>
+      <w:lvlText w:val="%4."/>
+      <w:lvlJc w:val="left"/>
+      <w:pPr>
+        <w:tabs>
+          <w:tab w:val="num" w:pos="2880"/>
+        </w:tabs>
+        <w:ind w:left="2880" w:hanging="360"/>
+      </w:pPr>
+    </w:lvl>
+    <w:lvl w:ilvl="4" w:tentative="1">
+      <w:start w:val="1"/>
+      <w:numFmt w:val="decimal"/>
+      <w:lvlText w:val="%5."/>
+      <w:lvlJc w:val="left"/>
+      <w:pPr>
+        <w:tabs>
+          <w:tab w:val="num" w:pos="3600"/>
+        </w:tabs>
+        <w:ind w:left="3600" w:hanging="360"/>
+      </w:pPr>
+    </w:lvl>
+    <w:lvl w:ilvl="5" w:tentative="1">
+      <w:start w:val="1"/>
+      <w:numFmt w:val="decimal"/>
+      <w:lvlText w:val="%6."/>
+      <w:lvlJc w:val="left"/>
+      <w:pPr>
+        <w:tabs>
+          <w:tab w:val="num" w:pos="4320"/>
+        </w:tabs>
+        <w:ind w:left="4320" w:hanging="360"/>
+      </w:pPr>
+    </w:lvl>
+    <w:lvl w:ilvl="6" w:tentative="1">
+      <w:start w:val="1"/>
+      <w:numFmt w:val="decimal"/>
+      <w:lvlText w:val="%7."/>
+      <w:lvlJc w:val="left"/>
+      <w:pPr>
+        <w:tabs>
+          <w:tab w:val="num" w:pos="5040"/>
+        </w:tabs>
+        <w:ind w:left="5040" w:hanging="360"/>
+      </w:pPr>
+    </w:lvl>
+    <w:lvl w:ilvl="7" w:tentative="1">
+      <w:start w:val="1"/>
+      <w:numFmt w:val="decimal"/>
+      <w:lvlText w:val="%8."/>
+      <w:lvlJc w:val="left"/>
+      <w:pPr>
+        <w:tabs>
+          <w:tab w:val="num" w:pos="5760"/>
+        </w:tabs>
+        <w:ind w:left="5760" w:hanging="360"/>
+      </w:pPr>
+    </w:lvl>
+    <w:lvl w:ilvl="8" w:tentative="1">
+      <w:start w:val="1"/>
+      <w:numFmt w:val="decimal"/>
+      <w:lvlText w:val="%9."/>
+      <w:lvlJc w:val="left"/>
+      <w:pPr>
+        <w:tabs>
+          <w:tab w:val="num" w:pos="6480"/>
+        </w:tabs>
+        <w:ind w:left="6480" w:hanging="360"/>
+      </w:pPr>
+    </w:lvl>
+  </w:abstractNum>
+  <w:abstractNum w:abstractNumId="3" w15:restartNumberingAfterBreak="0">
     <w:nsid w:val="7FEF4DFF"/>
     <w:multiLevelType w:val="hybridMultilevel"/>
     <w:tmpl w:val="48B48784"/>
@@ -1820,13 +2026,16 @@
     </w:lvl>
   </w:abstractNum>
   <w:num w:numId="1" w16cid:durableId="1991203623">
-    <w:abstractNumId w:val="2"/>
+    <w:abstractNumId w:val="3"/>
   </w:num>
   <w:num w:numId="2" w16cid:durableId="1211650276">
     <w:abstractNumId w:val="1"/>
   </w:num>
   <w:num w:numId="3" w16cid:durableId="880434985">
     <w:abstractNumId w:val="0"/>
+  </w:num>
+  <w:num w:numId="4" w16cid:durableId="219832488">
+    <w:abstractNumId w:val="2"/>
   </w:num>
 </w:numbering>
 </file>

</xml_diff>